<commit_message>
Update UDC export modules and database utilities
</commit_message>
<xml_diff>
--- a/docs/install.docx
+++ b/docs/install.docx
@@ -1193,9 +1193,6 @@
       <w:pPr>
         <w:spacing w:before="100" w:beforeAutospacing="1" w:after="100" w:afterAutospacing="1" w:line="240" w:lineRule="auto"/>
         <w:rPr>
-          <w:rFonts w:eastAsia="Times New Roman" w:cstheme="minorHAnsi"/>
-          <w:sz w:val="24"/>
-          <w:szCs w:val="24"/>
           <w:lang w:val="ru-UA"/>
         </w:rPr>
       </w:pPr>
@@ -1237,7 +1234,6 @@
         <w:t xml:space="preserve"> </w:t>
       </w:r>
       <w:proofErr w:type="spellStart"/>
-      <w:proofErr w:type="gramStart"/>
       <w:r>
         <w:t>venv</w:t>
       </w:r>
@@ -1253,7 +1249,6 @@
         <w:t>venv</w:t>
       </w:r>
       <w:proofErr w:type="spellEnd"/>
-      <w:proofErr w:type="gramEnd"/>
       <w:r>
         <w:rPr>
           <w:lang w:val="uk-UA"/>
@@ -1347,11 +1342,6 @@
           <w:lang w:val="uk-UA"/>
         </w:rPr>
         <w:br/>
-      </w:r>
-      <w:r>
-        <w:rPr>
-          <w:lang w:val="uk-UA"/>
-        </w:rPr>
         <w:t>.\.</w:t>
       </w:r>
       <w:proofErr w:type="spellStart"/>
@@ -1582,6 +1572,88 @@
         </w:rPr>
         <w:t xml:space="preserve"> потом только установка </w:t>
       </w:r>
+    </w:p>
+    <w:p>
+      <w:pPr>
+        <w:spacing w:before="100" w:beforeAutospacing="1" w:after="100" w:afterAutospacing="1" w:line="240" w:lineRule="auto"/>
+        <w:rPr>
+          <w:rFonts w:eastAsia="Times New Roman" w:cstheme="minorHAnsi"/>
+          <w:sz w:val="24"/>
+          <w:szCs w:val="24"/>
+          <w:lang w:val="ru-UA"/>
+        </w:rPr>
+      </w:pPr>
+      <w:proofErr w:type="spellStart"/>
+      <w:r>
+        <w:rPr>
+          <w:rFonts w:eastAsia="Times New Roman" w:cstheme="minorHAnsi"/>
+          <w:sz w:val="24"/>
+          <w:szCs w:val="24"/>
+          <w:lang w:val="ru-UA"/>
+        </w:rPr>
+        <w:t>python</w:t>
+      </w:r>
+      <w:proofErr w:type="spellEnd"/>
+      <w:r>
+        <w:rPr>
+          <w:rFonts w:eastAsia="Times New Roman" w:cstheme="minorHAnsi"/>
+          <w:sz w:val="24"/>
+          <w:szCs w:val="24"/>
+          <w:lang w:val="ru-UA"/>
+        </w:rPr>
+        <w:t xml:space="preserve"> -m </w:t>
+      </w:r>
+      <w:proofErr w:type="spellStart"/>
+      <w:r>
+        <w:rPr>
+          <w:rFonts w:eastAsia="Times New Roman" w:cstheme="minorHAnsi"/>
+          <w:sz w:val="24"/>
+          <w:szCs w:val="24"/>
+          <w:lang w:val="ru-UA"/>
+        </w:rPr>
+        <w:t>pip</w:t>
+      </w:r>
+      <w:proofErr w:type="spellEnd"/>
+      <w:r>
+        <w:rPr>
+          <w:rFonts w:eastAsia="Times New Roman" w:cstheme="minorHAnsi"/>
+          <w:sz w:val="24"/>
+          <w:szCs w:val="24"/>
+          <w:lang w:val="ru-UA"/>
+        </w:rPr>
+        <w:t xml:space="preserve"> </w:t>
+      </w:r>
+      <w:proofErr w:type="spellStart"/>
+      <w:r>
+        <w:rPr>
+          <w:rFonts w:eastAsia="Times New Roman" w:cstheme="minorHAnsi"/>
+          <w:sz w:val="24"/>
+          <w:szCs w:val="24"/>
+          <w:lang w:val="ru-UA"/>
+        </w:rPr>
+        <w:t>install</w:t>
+      </w:r>
+      <w:proofErr w:type="spellEnd"/>
+      <w:r>
+        <w:rPr>
+          <w:rFonts w:eastAsia="Times New Roman" w:cstheme="minorHAnsi"/>
+          <w:sz w:val="24"/>
+          <w:szCs w:val="24"/>
+          <w:lang w:val="ru-UA"/>
+        </w:rPr>
+        <w:t xml:space="preserve"> </w:t>
+      </w:r>
+      <w:proofErr w:type="spellStart"/>
+      <w:r>
+        <w:rPr>
+          <w:rFonts w:eastAsia="Times New Roman" w:cstheme="minorHAnsi"/>
+          <w:sz w:val="24"/>
+          <w:szCs w:val="24"/>
+          <w:lang w:val="ru-UA"/>
+        </w:rPr>
+        <w:t>pandas</w:t>
+      </w:r>
+      <w:proofErr w:type="spellEnd"/>
     </w:p>
     <w:p>
       <w:pPr>

</xml_diff>